<commit_message>
Fluency Lab worksheets, Module 7: numbers only (no word problems), stacked proportions, matches new online levels
Co-Authored-By: Claude Opus 5.5 <noreply@anthropic.com>
Claude-Session: https://claude.ai/code/session_014YTiyifGRnSLg5sxKHwHzH
</commit_message>
<xml_diff>
--- a/grade8/Fluency-Lab-Package/module-materials/Module-7-Ratios/FluencyLab_M7_Core_Guided.docx
+++ b/grade8/Fluency-Lab-Package/module-materials/Module-7-Ratios/FluencyLab_M7_Core_Guided.docx
@@ -185,7 +185,7 @@
                 <w:sz w:val="24"/>
                 <w:szCs w:val="24"/>
               </w:rPr>
-              <w:t xml:space="preserve">12 : 8  =  3 : 2        (÷ 4)</w:t>
+              <w:t xml:space="preserve">12 : 8   =  3 : 2    (÷ 4)</w:t>
             </w:r>
           </w:p>
           <w:p>
@@ -201,12 +201,12 @@
                 <w:sz w:val="24"/>
                 <w:szCs w:val="24"/>
               </w:rPr>
-              <w:t xml:space="preserve">2 : 3  =  ? : 12  →  8   (× 4)</w:t>
+              <w:t xml:space="preserve">2 : 3    =  8 : 12   (× 4)</w:t>
             </w:r>
           </w:p>
           <w:p>
             <w:pPr>
-              <w:spacing w:after="0" w:line="300"/>
+              <w:spacing w:after="110" w:line="300"/>
             </w:pPr>
             <w:r>
               <w:rPr>
@@ -217,8 +217,343 @@
                 <w:sz w:val="24"/>
                 <w:szCs w:val="24"/>
               </w:rPr>
-              <w:t xml:space="preserve">180 miles ÷ 3 hours = 60 mph</w:t>
+              <w:t xml:space="preserve">180 : 3  =  60 : 1   (÷ 3)</w:t>
             </w:r>
+          </w:p>
+          <w:tbl>
+            <w:tblPr>
+              <w:tblW w:type="dxa" w:w="4120"/>
+              <w:jc w:val="left"/>
+              <w:tblBorders>
+                <w:top w:val="single" w:color="auto" w:sz="4"/>
+                <w:left w:val="single" w:color="auto" w:sz="4"/>
+                <w:bottom w:val="single" w:color="auto" w:sz="4"/>
+                <w:right w:val="single" w:color="auto" w:sz="4"/>
+                <w:insideH w:val="single" w:color="auto" w:sz="4"/>
+                <w:insideV w:val="single" w:color="auto" w:sz="4"/>
+              </w:tblBorders>
+            </w:tblPr>
+            <w:tblGrid>
+              <w:gridCol w:w="1000"/>
+              <w:gridCol w:w="600"/>
+              <w:gridCol w:w="700"/>
+              <w:gridCol w:w="720"/>
+              <w:gridCol w:w="1100"/>
+            </w:tblGrid>
+            <w:tr>
+              <w:tc>
+                <w:tcPr>
+                  <w:tcW w:type="dxa" w:w="1000"/>
+                  <w:tcBorders>
+                    <w:top w:val="none" w:color="FFFFFF" w:sz="0"/>
+                    <w:left w:val="none" w:color="FFFFFF" w:sz="0"/>
+                    <w:bottom w:val="none" w:color="FFFFFF" w:sz="0"/>
+                    <w:right w:val="none" w:color="FFFFFF" w:sz="0"/>
+                  </w:tcBorders>
+                  <w:tcMar>
+                    <w:top w:type="dxa" w:w="30"/>
+                    <w:left w:type="dxa" w:w="20"/>
+                    <w:bottom w:type="dxa" w:w="30"/>
+                    <w:right w:type="dxa" w:w="20"/>
+                  </w:tcMar>
+                  <w:vAlign w:val="center"/>
+                </w:tcPr>
+                <w:tbl>
+                  <w:tblPr>
+                    <w:tblW w:type="dxa" w:w="600"/>
+                    <w:jc w:val="center"/>
+                    <w:tblBorders>
+                      <w:top w:val="single" w:color="auto" w:sz="4"/>
+                      <w:left w:val="single" w:color="auto" w:sz="4"/>
+                      <w:bottom w:val="single" w:color="auto" w:sz="4"/>
+                      <w:right w:val="single" w:color="auto" w:sz="4"/>
+                      <w:insideH w:val="none" w:color="FFFFFF" w:sz="0"/>
+                      <w:insideV w:val="single" w:color="auto" w:sz="4"/>
+                    </w:tblBorders>
+                  </w:tblPr>
+                  <w:tblGrid>
+                    <w:gridCol w:w="600"/>
+                  </w:tblGrid>
+                  <w:tr>
+                    <w:tc>
+                      <w:tcPr>
+                        <w:tcW w:type="dxa" w:w="520"/>
+                        <w:tcBorders>
+                          <w:top w:val="none" w:color="FFFFFF" w:sz="0"/>
+                          <w:left w:val="none" w:color="FFFFFF" w:sz="0"/>
+                          <w:bottom w:val="single" w:color="1A1A1A" w:sz="8"/>
+                          <w:right w:val="none" w:color="FFFFFF" w:sz="0"/>
+                        </w:tcBorders>
+                        <w:tcMar>
+                          <w:top w:type="dxa" w:w="0"/>
+                          <w:left w:type="dxa" w:w="30"/>
+                          <w:bottom w:type="dxa" w:w="0"/>
+                          <w:right w:type="dxa" w:w="30"/>
+                        </w:tcMar>
+                      </w:tcPr>
+                      <w:p>
+                        <w:pPr>
+                          <w:spacing w:after="0" w:line="230"/>
+                          <w:jc w:val="center"/>
+                        </w:pPr>
+                        <w:r>
+                          <w:rPr>
+                            <w:rFonts w:ascii="Consolas" w:cs="Consolas" w:eastAsia="Consolas" w:hAnsi="Consolas"/>
+                            <w:b/>
+                            <w:bCs/>
+                            <w:color w:val="1A1A1A"/>
+                            <w:sz w:val="26"/>
+                            <w:szCs w:val="26"/>
+                          </w:rPr>
+                          <w:t xml:space="preserve">3</w:t>
+                        </w:r>
+                      </w:p>
+                    </w:tc>
+                  </w:tr>
+                  <w:tr>
+                    <w:tc>
+                      <w:tcPr>
+                        <w:tcW w:type="dxa" w:w="520"/>
+                        <w:tcBorders>
+                          <w:top w:val="none" w:color="FFFFFF" w:sz="0"/>
+                          <w:left w:val="none" w:color="FFFFFF" w:sz="0"/>
+                          <w:bottom w:val="none" w:color="FFFFFF" w:sz="0"/>
+                          <w:right w:val="none" w:color="FFFFFF" w:sz="0"/>
+                        </w:tcBorders>
+                        <w:tcMar>
+                          <w:top w:type="dxa" w:w="0"/>
+                          <w:left w:type="dxa" w:w="30"/>
+                          <w:bottom w:type="dxa" w:w="0"/>
+                          <w:right w:type="dxa" w:w="30"/>
+                        </w:tcMar>
+                      </w:tcPr>
+                      <w:p>
+                        <w:pPr>
+                          <w:spacing w:after="0" w:line="230"/>
+                          <w:jc w:val="center"/>
+                        </w:pPr>
+                        <w:r>
+                          <w:rPr>
+                            <w:rFonts w:ascii="Consolas" w:cs="Consolas" w:eastAsia="Consolas" w:hAnsi="Consolas"/>
+                            <w:b/>
+                            <w:bCs/>
+                            <w:color w:val="1A1A1A"/>
+                            <w:sz w:val="26"/>
+                            <w:szCs w:val="26"/>
+                          </w:rPr>
+                          <w:t xml:space="preserve">4</w:t>
+                        </w:r>
+                      </w:p>
+                    </w:tc>
+                  </w:tr>
+                </w:tbl>
+                <w:p/>
+              </w:tc>
+              <w:tc>
+                <w:tcPr>
+                  <w:tcW w:type="dxa" w:w="600"/>
+                  <w:tcBorders>
+                    <w:top w:val="none" w:color="FFFFFF" w:sz="0"/>
+                    <w:left w:val="none" w:color="FFFFFF" w:sz="0"/>
+                    <w:bottom w:val="none" w:color="FFFFFF" w:sz="0"/>
+                    <w:right w:val="none" w:color="FFFFFF" w:sz="0"/>
+                  </w:tcBorders>
+                  <w:tcMar>
+                    <w:top w:type="dxa" w:w="30"/>
+                    <w:left w:type="dxa" w:w="10"/>
+                    <w:bottom w:type="dxa" w:w="30"/>
+                    <w:right w:type="dxa" w:w="10"/>
+                  </w:tcMar>
+                  <w:vAlign w:val="center"/>
+                </w:tcPr>
+                <w:p>
+                  <w:pPr>
+                    <w:jc w:val="center"/>
+                  </w:pPr>
+                  <w:r>
+                    <w:rPr>
+                      <w:rFonts w:ascii="Consolas" w:cs="Consolas" w:eastAsia="Consolas" w:hAnsi="Consolas"/>
+                      <w:b/>
+                      <w:bCs/>
+                      <w:color w:val="1A1A1A"/>
+                      <w:sz w:val="24"/>
+                      <w:szCs w:val="24"/>
+                    </w:rPr>
+                    <w:t xml:space="preserve">=</w:t>
+                  </w:r>
+                </w:p>
+              </w:tc>
+              <w:tc>
+                <w:tcPr>
+                  <w:tcW w:type="dxa" w:w="700"/>
+                  <w:tcBorders>
+                    <w:top w:val="none" w:color="FFFFFF" w:sz="0"/>
+                    <w:left w:val="none" w:color="FFFFFF" w:sz="0"/>
+                    <w:bottom w:val="none" w:color="FFFFFF" w:sz="0"/>
+                    <w:right w:val="none" w:color="FFFFFF" w:sz="0"/>
+                  </w:tcBorders>
+                  <w:tcMar>
+                    <w:top w:type="dxa" w:w="30"/>
+                    <w:left w:type="dxa" w:w="20"/>
+                    <w:bottom w:type="dxa" w:w="30"/>
+                    <w:right w:type="dxa" w:w="20"/>
+                  </w:tcMar>
+                  <w:vAlign w:val="center"/>
+                </w:tcPr>
+                <w:tbl>
+                  <w:tblPr>
+                    <w:tblW w:type="dxa" w:w="600"/>
+                    <w:jc w:val="center"/>
+                    <w:tblBorders>
+                      <w:top w:val="single" w:color="auto" w:sz="4"/>
+                      <w:left w:val="single" w:color="auto" w:sz="4"/>
+                      <w:bottom w:val="single" w:color="auto" w:sz="4"/>
+                      <w:right w:val="single" w:color="auto" w:sz="4"/>
+                      <w:insideH w:val="none" w:color="FFFFFF" w:sz="0"/>
+                      <w:insideV w:val="single" w:color="auto" w:sz="4"/>
+                    </w:tblBorders>
+                  </w:tblPr>
+                  <w:tblGrid>
+                    <w:gridCol w:w="600"/>
+                  </w:tblGrid>
+                  <w:tr>
+                    <w:tc>
+                      <w:tcPr>
+                        <w:tcW w:type="dxa" w:w="520"/>
+                        <w:tcBorders>
+                          <w:top w:val="none" w:color="FFFFFF" w:sz="0"/>
+                          <w:left w:val="none" w:color="FFFFFF" w:sz="0"/>
+                          <w:bottom w:val="single" w:color="1A1A1A" w:sz="8"/>
+                          <w:right w:val="none" w:color="FFFFFF" w:sz="0"/>
+                        </w:tcBorders>
+                        <w:tcMar>
+                          <w:top w:type="dxa" w:w="0"/>
+                          <w:left w:type="dxa" w:w="30"/>
+                          <w:bottom w:type="dxa" w:w="0"/>
+                          <w:right w:type="dxa" w:w="30"/>
+                        </w:tcMar>
+                      </w:tcPr>
+                      <w:p>
+                        <w:pPr>
+                          <w:spacing w:after="0" w:line="230"/>
+                          <w:jc w:val="center"/>
+                        </w:pPr>
+                        <w:r>
+                          <w:rPr>
+                            <w:rFonts w:ascii="Consolas" w:cs="Consolas" w:eastAsia="Consolas" w:hAnsi="Consolas"/>
+                            <w:b/>
+                            <w:bCs/>
+                            <w:color w:val="1A1A1A"/>
+                            <w:sz w:val="26"/>
+                            <w:szCs w:val="26"/>
+                          </w:rPr>
+                          <w:t xml:space="preserve">6</w:t>
+                        </w:r>
+                      </w:p>
+                    </w:tc>
+                  </w:tr>
+                  <w:tr>
+                    <w:tc>
+                      <w:tcPr>
+                        <w:tcW w:type="dxa" w:w="520"/>
+                        <w:tcBorders>
+                          <w:top w:val="none" w:color="FFFFFF" w:sz="0"/>
+                          <w:left w:val="none" w:color="FFFFFF" w:sz="0"/>
+                          <w:bottom w:val="none" w:color="FFFFFF" w:sz="0"/>
+                          <w:right w:val="none" w:color="FFFFFF" w:sz="0"/>
+                        </w:tcBorders>
+                        <w:tcMar>
+                          <w:top w:type="dxa" w:w="0"/>
+                          <w:left w:type="dxa" w:w="30"/>
+                          <w:bottom w:type="dxa" w:w="0"/>
+                          <w:right w:type="dxa" w:w="30"/>
+                        </w:tcMar>
+                      </w:tcPr>
+                      <w:p>
+                        <w:pPr>
+                          <w:spacing w:after="0" w:line="230"/>
+                          <w:jc w:val="center"/>
+                        </w:pPr>
+                        <w:r>
+                          <w:rPr>
+                            <w:rFonts w:ascii="Consolas" w:cs="Consolas" w:eastAsia="Consolas" w:hAnsi="Consolas"/>
+                            <w:b/>
+                            <w:bCs/>
+                            <w:color w:val="1A1A1A"/>
+                            <w:sz w:val="26"/>
+                            <w:szCs w:val="26"/>
+                          </w:rPr>
+                          <w:t xml:space="preserve">8</w:t>
+                        </w:r>
+                      </w:p>
+                    </w:tc>
+                  </w:tr>
+                </w:tbl>
+                <w:p/>
+              </w:tc>
+              <w:tc>
+                <w:tcPr>
+                  <w:tcW w:type="dxa" w:w="720"/>
+                  <w:tcBorders>
+                    <w:top w:val="none" w:color="FFFFFF" w:sz="0"/>
+                    <w:left w:val="none" w:color="FFFFFF" w:sz="0"/>
+                    <w:bottom w:val="none" w:color="FFFFFF" w:sz="0"/>
+                    <w:right w:val="none" w:color="FFFFFF" w:sz="0"/>
+                  </w:tcBorders>
+                  <w:tcMar>
+                    <w:top w:type="dxa" w:w="30"/>
+                    <w:left w:type="dxa" w:w="10"/>
+                    <w:bottom w:type="dxa" w:w="30"/>
+                    <w:right w:type="dxa" w:w="10"/>
+                  </w:tcMar>
+                  <w:vAlign w:val="center"/>
+                </w:tcPr>
+                <w:p>
+                  <w:pPr>
+                    <w:jc w:val="center"/>
+                  </w:pPr>
+                </w:p>
+              </w:tc>
+              <w:tc>
+                <w:tcPr>
+                  <w:tcW w:type="dxa" w:w="1100"/>
+                  <w:tcBorders>
+                    <w:top w:val="none" w:color="FFFFFF" w:sz="0"/>
+                    <w:left w:val="none" w:color="FFFFFF" w:sz="0"/>
+                    <w:bottom w:val="none" w:color="FFFFFF" w:sz="0"/>
+                    <w:right w:val="none" w:color="FFFFFF" w:sz="0"/>
+                  </w:tcBorders>
+                  <w:tcMar>
+                    <w:top w:type="dxa" w:w="30"/>
+                    <w:left w:type="dxa" w:w="10"/>
+                    <w:bottom w:type="dxa" w:w="30"/>
+                    <w:right w:type="dxa" w:w="10"/>
+                  </w:tcMar>
+                  <w:vAlign w:val="center"/>
+                </w:tcPr>
+                <w:p>
+                  <w:pPr>
+                    <w:jc w:val="left"/>
+                  </w:pPr>
+                  <w:r>
+                    <w:rPr>
+                      <w:rFonts w:ascii="Consolas" w:cs="Consolas" w:eastAsia="Consolas" w:hAnsi="Consolas"/>
+                      <w:b/>
+                      <w:bCs/>
+                      <w:color w:val="1A1A1A"/>
+                      <w:sz w:val="24"/>
+                      <w:szCs w:val="24"/>
+                    </w:rPr>
+                    <w:t xml:space="preserve">(× 2)</w:t>
+                  </w:r>
+                </w:p>
+              </w:tc>
+            </w:tr>
+          </w:tbl>
+          <w:p>
+            <w:pPr>
+              <w:spacing w:after="0" w:line="120" w:lineRule="exact"/>
+            </w:pPr>
           </w:p>
         </w:tc>
       </w:tr>
@@ -237,7 +572,7 @@
           <w:sz w:val="22"/>
           <w:szCs w:val="22"/>
         </w:rPr>
-        <w:t xml:space="preserve">Simplify by dividing both numbers by their greatest common factor.</w:t>
+        <w:t xml:space="preserve">Simplify: divide both by greatest common factor.</w:t>
       </w:r>
     </w:p>
     <w:p>
@@ -254,7 +589,7 @@
           <w:sz w:val="22"/>
           <w:szCs w:val="22"/>
         </w:rPr>
-        <w:t xml:space="preserve">Scale up or down by multiplying (or dividing) both numbers by the same amount.</w:t>
+        <w:t xml:space="preserve">Equivalent: multiply both by the same number.</w:t>
       </w:r>
     </w:p>
     <w:p>
@@ -271,7 +606,7 @@
           <w:sz w:val="22"/>
           <w:szCs w:val="22"/>
         </w:rPr>
-        <w:t xml:space="preserve">Unit rate: divide to find the amount 'per one'.</w:t>
+        <w:t xml:space="preserve">Unit rate: divide to get ? : 1.</w:t>
       </w:r>
     </w:p>
     <w:p>
@@ -288,7 +623,7 @@
           <w:sz w:val="22"/>
           <w:szCs w:val="22"/>
         </w:rPr>
-        <w:t xml:space="preserve">Proportion: find the scale factor or unit rate first.</w:t>
+        <w:t xml:space="preserve">Proportion: find the scale factor first.</w:t>
       </w:r>
     </w:p>
     <w:p>
@@ -304,7 +639,7 @@
           <w:sz w:val="26"/>
           <w:szCs w:val="26"/>
         </w:rPr>
-        <w:t xml:space="preserve">Guided practice — fill in each step</w:t>
+        <w:t xml:space="preserve">Guided practice</w:t>
       </w:r>
     </w:p>
     <w:p>
@@ -528,7 +863,7 @@
           <w:sz w:val="23"/>
           <w:szCs w:val="23"/>
         </w:rPr>
-        <w:t xml:space="preserve">240 miles in 4 hours</w:t>
+        <w:t xml:space="preserve">240 : 4  =  ? : 1</w:t>
       </w:r>
     </w:p>
     <w:tbl>
@@ -591,7 +926,7 @@
                 <w:sz w:val="22"/>
                 <w:szCs w:val="22"/>
               </w:rPr>
-              <w:t xml:space="preserve">Divide for 'per one':  240 ÷ 4 = ______ miles per hour</w:t>
+              <w:t xml:space="preserve">240 ÷ 4 = ______ ,  so  ? = ______</w:t>
             </w:r>
           </w:p>
         </w:tc>
@@ -646,29 +981,128 @@
               <w:right w:type="dxa" w:w="120"/>
             </w:tcMar>
           </w:tcPr>
+          <w:tbl>
+            <w:tblPr>
+              <w:tblW w:type="dxa" w:w="4360"/>
+              <w:jc w:val="left"/>
+              <w:tblBorders>
+                <w:top w:val="single" w:color="auto" w:sz="4"/>
+                <w:left w:val="single" w:color="auto" w:sz="4"/>
+                <w:bottom w:val="single" w:color="auto" w:sz="4"/>
+                <w:right w:val="single" w:color="auto" w:sz="4"/>
+                <w:insideH w:val="single" w:color="auto" w:sz="4"/>
+                <w:insideV w:val="single" w:color="auto" w:sz="4"/>
+              </w:tblBorders>
+            </w:tblPr>
+            <w:tblGrid>
+              <w:gridCol w:w="360"/>
+              <w:gridCol w:w="2300"/>
+              <w:gridCol w:w="1700"/>
+            </w:tblGrid>
+            <w:tr>
+              <w:tc>
+                <w:tcPr>
+                  <w:tcW w:type="dxa" w:w="360"/>
+                  <w:tcBorders>
+                    <w:top w:val="none" w:color="FFFFFF" w:sz="0"/>
+                    <w:left w:val="none" w:color="FFFFFF" w:sz="0"/>
+                    <w:bottom w:val="none" w:color="FFFFFF" w:sz="0"/>
+                    <w:right w:val="none" w:color="FFFFFF" w:sz="0"/>
+                  </w:tcBorders>
+                  <w:tcMar>
+                    <w:top w:type="dxa" w:w="30"/>
+                    <w:left w:type="dxa" w:w="10"/>
+                    <w:bottom w:type="dxa" w:w="30"/>
+                    <w:right w:type="dxa" w:w="10"/>
+                  </w:tcMar>
+                  <w:vAlign w:val="center"/>
+                </w:tcPr>
+                <w:p>
+                  <w:pPr>
+                    <w:jc w:val="left"/>
+                  </w:pPr>
+                  <w:r>
+                    <w:rPr>
+                      <w:b/>
+                      <w:bCs/>
+                      <w:color w:val="2E5A87"/>
+                      <w:sz w:val="20"/>
+                      <w:szCs w:val="20"/>
+                    </w:rPr>
+                    <w:t xml:space="preserve">1)</w:t>
+                  </w:r>
+                </w:p>
+              </w:tc>
+              <w:tc>
+                <w:tcPr>
+                  <w:tcW w:type="dxa" w:w="2300"/>
+                  <w:tcBorders>
+                    <w:top w:val="none" w:color="FFFFFF" w:sz="0"/>
+                    <w:left w:val="none" w:color="FFFFFF" w:sz="0"/>
+                    <w:bottom w:val="none" w:color="FFFFFF" w:sz="0"/>
+                    <w:right w:val="none" w:color="FFFFFF" w:sz="0"/>
+                  </w:tcBorders>
+                  <w:tcMar>
+                    <w:top w:type="dxa" w:w="30"/>
+                    <w:left w:type="dxa" w:w="10"/>
+                    <w:bottom w:type="dxa" w:w="30"/>
+                    <w:right w:type="dxa" w:w="10"/>
+                  </w:tcMar>
+                  <w:vAlign w:val="center"/>
+                </w:tcPr>
+                <w:p>
+                  <w:pPr>
+                    <w:jc w:val="left"/>
+                  </w:pPr>
+                  <w:r>
+                    <w:rPr>
+                      <w:rFonts w:ascii="Consolas" w:cs="Consolas" w:eastAsia="Consolas" w:hAnsi="Consolas"/>
+                      <w:color w:val="1A1A1A"/>
+                      <w:sz w:val="22"/>
+                      <w:szCs w:val="22"/>
+                    </w:rPr>
+                    <w:t xml:space="preserve">Simplify 10 : 4</w:t>
+                  </w:r>
+                </w:p>
+              </w:tc>
+              <w:tc>
+                <w:tcPr>
+                  <w:tcW w:type="dxa" w:w="1700"/>
+                  <w:tcBorders>
+                    <w:top w:val="none" w:color="FFFFFF" w:sz="0"/>
+                    <w:left w:val="none" w:color="FFFFFF" w:sz="0"/>
+                    <w:bottom w:val="none" w:color="FFFFFF" w:sz="0"/>
+                    <w:right w:val="none" w:color="FFFFFF" w:sz="0"/>
+                  </w:tcBorders>
+                  <w:tcMar>
+                    <w:top w:type="dxa" w:w="30"/>
+                    <w:left w:type="dxa" w:w="10"/>
+                    <w:bottom w:type="dxa" w:w="30"/>
+                    <w:right w:type="dxa" w:w="10"/>
+                  </w:tcMar>
+                  <w:vAlign w:val="center"/>
+                </w:tcPr>
+                <w:p>
+                  <w:pPr>
+                    <w:jc w:val="left"/>
+                  </w:pPr>
+                  <w:r>
+                    <w:rPr>
+                      <w:rFonts w:ascii="Consolas" w:cs="Consolas" w:eastAsia="Consolas" w:hAnsi="Consolas"/>
+                      <w:color w:val="1A1A1A"/>
+                      <w:sz w:val="22"/>
+                      <w:szCs w:val="22"/>
+                    </w:rPr>
+                    <w:t xml:space="preserve">= ___ : ___</w:t>
+                  </w:r>
+                </w:p>
+              </w:tc>
+            </w:tr>
+          </w:tbl>
           <w:p>
             <w:pPr>
-              <w:spacing w:line="320"/>
+              <w:spacing w:after="0" w:line="120" w:lineRule="exact"/>
             </w:pPr>
-            <w:r>
-              <w:rPr>
-                <w:b/>
-                <w:bCs/>
-                <w:color w:val="2E5A87"/>
-                <w:sz w:val="20"/>
-                <w:szCs w:val="20"/>
-              </w:rPr>
-              <w:t xml:space="preserve">1)  </w:t>
-            </w:r>
-            <w:r>
-              <w:rPr>
-                <w:rFonts w:ascii="Consolas" w:cs="Consolas" w:eastAsia="Consolas" w:hAnsi="Consolas"/>
-                <w:color w:val="1A1A1A"/>
-                <w:sz w:val="22"/>
-                <w:szCs w:val="22"/>
-              </w:rPr>
-              <w:t xml:space="preserve">Simplify 10 : 4  =  ______</w:t>
-            </w:r>
           </w:p>
         </w:tc>
         <w:tc>
@@ -687,29 +1121,128 @@
               <w:right w:type="dxa" w:w="120"/>
             </w:tcMar>
           </w:tcPr>
+          <w:tbl>
+            <w:tblPr>
+              <w:tblW w:type="dxa" w:w="4360"/>
+              <w:jc w:val="left"/>
+              <w:tblBorders>
+                <w:top w:val="single" w:color="auto" w:sz="4"/>
+                <w:left w:val="single" w:color="auto" w:sz="4"/>
+                <w:bottom w:val="single" w:color="auto" w:sz="4"/>
+                <w:right w:val="single" w:color="auto" w:sz="4"/>
+                <w:insideH w:val="single" w:color="auto" w:sz="4"/>
+                <w:insideV w:val="single" w:color="auto" w:sz="4"/>
+              </w:tblBorders>
+            </w:tblPr>
+            <w:tblGrid>
+              <w:gridCol w:w="360"/>
+              <w:gridCol w:w="2300"/>
+              <w:gridCol w:w="1700"/>
+            </w:tblGrid>
+            <w:tr>
+              <w:tc>
+                <w:tcPr>
+                  <w:tcW w:type="dxa" w:w="360"/>
+                  <w:tcBorders>
+                    <w:top w:val="none" w:color="FFFFFF" w:sz="0"/>
+                    <w:left w:val="none" w:color="FFFFFF" w:sz="0"/>
+                    <w:bottom w:val="none" w:color="FFFFFF" w:sz="0"/>
+                    <w:right w:val="none" w:color="FFFFFF" w:sz="0"/>
+                  </w:tcBorders>
+                  <w:tcMar>
+                    <w:top w:type="dxa" w:w="30"/>
+                    <w:left w:type="dxa" w:w="10"/>
+                    <w:bottom w:type="dxa" w:w="30"/>
+                    <w:right w:type="dxa" w:w="10"/>
+                  </w:tcMar>
+                  <w:vAlign w:val="center"/>
+                </w:tcPr>
+                <w:p>
+                  <w:pPr>
+                    <w:jc w:val="left"/>
+                  </w:pPr>
+                  <w:r>
+                    <w:rPr>
+                      <w:b/>
+                      <w:bCs/>
+                      <w:color w:val="2E5A87"/>
+                      <w:sz w:val="20"/>
+                      <w:szCs w:val="20"/>
+                    </w:rPr>
+                    <w:t xml:space="preserve">2)</w:t>
+                  </w:r>
+                </w:p>
+              </w:tc>
+              <w:tc>
+                <w:tcPr>
+                  <w:tcW w:type="dxa" w:w="2300"/>
+                  <w:tcBorders>
+                    <w:top w:val="none" w:color="FFFFFF" w:sz="0"/>
+                    <w:left w:val="none" w:color="FFFFFF" w:sz="0"/>
+                    <w:bottom w:val="none" w:color="FFFFFF" w:sz="0"/>
+                    <w:right w:val="none" w:color="FFFFFF" w:sz="0"/>
+                  </w:tcBorders>
+                  <w:tcMar>
+                    <w:top w:type="dxa" w:w="30"/>
+                    <w:left w:type="dxa" w:w="10"/>
+                    <w:bottom w:type="dxa" w:w="30"/>
+                    <w:right w:type="dxa" w:w="10"/>
+                  </w:tcMar>
+                  <w:vAlign w:val="center"/>
+                </w:tcPr>
+                <w:p>
+                  <w:pPr>
+                    <w:jc w:val="left"/>
+                  </w:pPr>
+                  <w:r>
+                    <w:rPr>
+                      <w:rFonts w:ascii="Consolas" w:cs="Consolas" w:eastAsia="Consolas" w:hAnsi="Consolas"/>
+                      <w:color w:val="1A1A1A"/>
+                      <w:sz w:val="22"/>
+                      <w:szCs w:val="22"/>
+                    </w:rPr>
+                    <w:t xml:space="preserve">Simplify 6 : 9</w:t>
+                  </w:r>
+                </w:p>
+              </w:tc>
+              <w:tc>
+                <w:tcPr>
+                  <w:tcW w:type="dxa" w:w="1700"/>
+                  <w:tcBorders>
+                    <w:top w:val="none" w:color="FFFFFF" w:sz="0"/>
+                    <w:left w:val="none" w:color="FFFFFF" w:sz="0"/>
+                    <w:bottom w:val="none" w:color="FFFFFF" w:sz="0"/>
+                    <w:right w:val="none" w:color="FFFFFF" w:sz="0"/>
+                  </w:tcBorders>
+                  <w:tcMar>
+                    <w:top w:type="dxa" w:w="30"/>
+                    <w:left w:type="dxa" w:w="10"/>
+                    <w:bottom w:type="dxa" w:w="30"/>
+                    <w:right w:type="dxa" w:w="10"/>
+                  </w:tcMar>
+                  <w:vAlign w:val="center"/>
+                </w:tcPr>
+                <w:p>
+                  <w:pPr>
+                    <w:jc w:val="left"/>
+                  </w:pPr>
+                  <w:r>
+                    <w:rPr>
+                      <w:rFonts w:ascii="Consolas" w:cs="Consolas" w:eastAsia="Consolas" w:hAnsi="Consolas"/>
+                      <w:color w:val="1A1A1A"/>
+                      <w:sz w:val="22"/>
+                      <w:szCs w:val="22"/>
+                    </w:rPr>
+                    <w:t xml:space="preserve">= ___ : ___</w:t>
+                  </w:r>
+                </w:p>
+              </w:tc>
+            </w:tr>
+          </w:tbl>
           <w:p>
             <w:pPr>
-              <w:spacing w:line="320"/>
+              <w:spacing w:after="0" w:line="120" w:lineRule="exact"/>
             </w:pPr>
-            <w:r>
-              <w:rPr>
-                <w:b/>
-                <w:bCs/>
-                <w:color w:val="2E5A87"/>
-                <w:sz w:val="20"/>
-                <w:szCs w:val="20"/>
-              </w:rPr>
-              <w:t xml:space="preserve">2)  </w:t>
-            </w:r>
-            <w:r>
-              <w:rPr>
-                <w:rFonts w:ascii="Consolas" w:cs="Consolas" w:eastAsia="Consolas" w:hAnsi="Consolas"/>
-                <w:color w:val="1A1A1A"/>
-                <w:sz w:val="22"/>
-                <w:szCs w:val="22"/>
-              </w:rPr>
-              <w:t xml:space="preserve">Simplify 6 : 9  =  ______</w:t>
-            </w:r>
           </w:p>
         </w:tc>
       </w:tr>
@@ -730,29 +1263,128 @@
               <w:right w:type="dxa" w:w="120"/>
             </w:tcMar>
           </w:tcPr>
+          <w:tbl>
+            <w:tblPr>
+              <w:tblW w:type="dxa" w:w="4360"/>
+              <w:jc w:val="left"/>
+              <w:tblBorders>
+                <w:top w:val="single" w:color="auto" w:sz="4"/>
+                <w:left w:val="single" w:color="auto" w:sz="4"/>
+                <w:bottom w:val="single" w:color="auto" w:sz="4"/>
+                <w:right w:val="single" w:color="auto" w:sz="4"/>
+                <w:insideH w:val="single" w:color="auto" w:sz="4"/>
+                <w:insideV w:val="single" w:color="auto" w:sz="4"/>
+              </w:tblBorders>
+            </w:tblPr>
+            <w:tblGrid>
+              <w:gridCol w:w="360"/>
+              <w:gridCol w:w="2300"/>
+              <w:gridCol w:w="1700"/>
+            </w:tblGrid>
+            <w:tr>
+              <w:tc>
+                <w:tcPr>
+                  <w:tcW w:type="dxa" w:w="360"/>
+                  <w:tcBorders>
+                    <w:top w:val="none" w:color="FFFFFF" w:sz="0"/>
+                    <w:left w:val="none" w:color="FFFFFF" w:sz="0"/>
+                    <w:bottom w:val="none" w:color="FFFFFF" w:sz="0"/>
+                    <w:right w:val="none" w:color="FFFFFF" w:sz="0"/>
+                  </w:tcBorders>
+                  <w:tcMar>
+                    <w:top w:type="dxa" w:w="30"/>
+                    <w:left w:type="dxa" w:w="10"/>
+                    <w:bottom w:type="dxa" w:w="30"/>
+                    <w:right w:type="dxa" w:w="10"/>
+                  </w:tcMar>
+                  <w:vAlign w:val="center"/>
+                </w:tcPr>
+                <w:p>
+                  <w:pPr>
+                    <w:jc w:val="left"/>
+                  </w:pPr>
+                  <w:r>
+                    <w:rPr>
+                      <w:b/>
+                      <w:bCs/>
+                      <w:color w:val="2E5A87"/>
+                      <w:sz w:val="20"/>
+                      <w:szCs w:val="20"/>
+                    </w:rPr>
+                    <w:t xml:space="preserve">3)</w:t>
+                  </w:r>
+                </w:p>
+              </w:tc>
+              <w:tc>
+                <w:tcPr>
+                  <w:tcW w:type="dxa" w:w="2300"/>
+                  <w:tcBorders>
+                    <w:top w:val="none" w:color="FFFFFF" w:sz="0"/>
+                    <w:left w:val="none" w:color="FFFFFF" w:sz="0"/>
+                    <w:bottom w:val="none" w:color="FFFFFF" w:sz="0"/>
+                    <w:right w:val="none" w:color="FFFFFF" w:sz="0"/>
+                  </w:tcBorders>
+                  <w:tcMar>
+                    <w:top w:type="dxa" w:w="30"/>
+                    <w:left w:type="dxa" w:w="10"/>
+                    <w:bottom w:type="dxa" w:w="30"/>
+                    <w:right w:type="dxa" w:w="10"/>
+                  </w:tcMar>
+                  <w:vAlign w:val="center"/>
+                </w:tcPr>
+                <w:p>
+                  <w:pPr>
+                    <w:jc w:val="left"/>
+                  </w:pPr>
+                  <w:r>
+                    <w:rPr>
+                      <w:rFonts w:ascii="Consolas" w:cs="Consolas" w:eastAsia="Consolas" w:hAnsi="Consolas"/>
+                      <w:color w:val="1A1A1A"/>
+                      <w:sz w:val="22"/>
+                      <w:szCs w:val="22"/>
+                    </w:rPr>
+                    <w:t xml:space="preserve">2 : 5 = ? : 20</w:t>
+                  </w:r>
+                </w:p>
+              </w:tc>
+              <w:tc>
+                <w:tcPr>
+                  <w:tcW w:type="dxa" w:w="1700"/>
+                  <w:tcBorders>
+                    <w:top w:val="none" w:color="FFFFFF" w:sz="0"/>
+                    <w:left w:val="none" w:color="FFFFFF" w:sz="0"/>
+                    <w:bottom w:val="none" w:color="FFFFFF" w:sz="0"/>
+                    <w:right w:val="none" w:color="FFFFFF" w:sz="0"/>
+                  </w:tcBorders>
+                  <w:tcMar>
+                    <w:top w:type="dxa" w:w="30"/>
+                    <w:left w:type="dxa" w:w="10"/>
+                    <w:bottom w:type="dxa" w:w="30"/>
+                    <w:right w:type="dxa" w:w="10"/>
+                  </w:tcMar>
+                  <w:vAlign w:val="center"/>
+                </w:tcPr>
+                <w:p>
+                  <w:pPr>
+                    <w:jc w:val="left"/>
+                  </w:pPr>
+                  <w:r>
+                    <w:rPr>
+                      <w:rFonts w:ascii="Consolas" w:cs="Consolas" w:eastAsia="Consolas" w:hAnsi="Consolas"/>
+                      <w:color w:val="1A1A1A"/>
+                      <w:sz w:val="22"/>
+                      <w:szCs w:val="22"/>
+                    </w:rPr>
+                    <w:t xml:space="preserve">? = ______</w:t>
+                  </w:r>
+                </w:p>
+              </w:tc>
+            </w:tr>
+          </w:tbl>
           <w:p>
             <w:pPr>
-              <w:spacing w:line="320"/>
+              <w:spacing w:after="0" w:line="120" w:lineRule="exact"/>
             </w:pPr>
-            <w:r>
-              <w:rPr>
-                <w:b/>
-                <w:bCs/>
-                <w:color w:val="2E5A87"/>
-                <w:sz w:val="20"/>
-                <w:szCs w:val="20"/>
-              </w:rPr>
-              <w:t xml:space="preserve">3)  </w:t>
-            </w:r>
-            <w:r>
-              <w:rPr>
-                <w:rFonts w:ascii="Consolas" w:cs="Consolas" w:eastAsia="Consolas" w:hAnsi="Consolas"/>
-                <w:color w:val="1A1A1A"/>
-                <w:sz w:val="22"/>
-                <w:szCs w:val="22"/>
-              </w:rPr>
-              <w:t xml:space="preserve">2 : 5 = ? : 20  =  ______</w:t>
-            </w:r>
           </w:p>
         </w:tc>
         <w:tc>
@@ -771,29 +1403,128 @@
               <w:right w:type="dxa" w:w="120"/>
             </w:tcMar>
           </w:tcPr>
+          <w:tbl>
+            <w:tblPr>
+              <w:tblW w:type="dxa" w:w="4360"/>
+              <w:jc w:val="left"/>
+              <w:tblBorders>
+                <w:top w:val="single" w:color="auto" w:sz="4"/>
+                <w:left w:val="single" w:color="auto" w:sz="4"/>
+                <w:bottom w:val="single" w:color="auto" w:sz="4"/>
+                <w:right w:val="single" w:color="auto" w:sz="4"/>
+                <w:insideH w:val="single" w:color="auto" w:sz="4"/>
+                <w:insideV w:val="single" w:color="auto" w:sz="4"/>
+              </w:tblBorders>
+            </w:tblPr>
+            <w:tblGrid>
+              <w:gridCol w:w="360"/>
+              <w:gridCol w:w="2300"/>
+              <w:gridCol w:w="1700"/>
+            </w:tblGrid>
+            <w:tr>
+              <w:tc>
+                <w:tcPr>
+                  <w:tcW w:type="dxa" w:w="360"/>
+                  <w:tcBorders>
+                    <w:top w:val="none" w:color="FFFFFF" w:sz="0"/>
+                    <w:left w:val="none" w:color="FFFFFF" w:sz="0"/>
+                    <w:bottom w:val="none" w:color="FFFFFF" w:sz="0"/>
+                    <w:right w:val="none" w:color="FFFFFF" w:sz="0"/>
+                  </w:tcBorders>
+                  <w:tcMar>
+                    <w:top w:type="dxa" w:w="30"/>
+                    <w:left w:type="dxa" w:w="10"/>
+                    <w:bottom w:type="dxa" w:w="30"/>
+                    <w:right w:type="dxa" w:w="10"/>
+                  </w:tcMar>
+                  <w:vAlign w:val="center"/>
+                </w:tcPr>
+                <w:p>
+                  <w:pPr>
+                    <w:jc w:val="left"/>
+                  </w:pPr>
+                  <w:r>
+                    <w:rPr>
+                      <w:b/>
+                      <w:bCs/>
+                      <w:color w:val="2E5A87"/>
+                      <w:sz w:val="20"/>
+                      <w:szCs w:val="20"/>
+                    </w:rPr>
+                    <w:t xml:space="preserve">4)</w:t>
+                  </w:r>
+                </w:p>
+              </w:tc>
+              <w:tc>
+                <w:tcPr>
+                  <w:tcW w:type="dxa" w:w="2300"/>
+                  <w:tcBorders>
+                    <w:top w:val="none" w:color="FFFFFF" w:sz="0"/>
+                    <w:left w:val="none" w:color="FFFFFF" w:sz="0"/>
+                    <w:bottom w:val="none" w:color="FFFFFF" w:sz="0"/>
+                    <w:right w:val="none" w:color="FFFFFF" w:sz="0"/>
+                  </w:tcBorders>
+                  <w:tcMar>
+                    <w:top w:type="dxa" w:w="30"/>
+                    <w:left w:type="dxa" w:w="10"/>
+                    <w:bottom w:type="dxa" w:w="30"/>
+                    <w:right w:type="dxa" w:w="10"/>
+                  </w:tcMar>
+                  <w:vAlign w:val="center"/>
+                </w:tcPr>
+                <w:p>
+                  <w:pPr>
+                    <w:jc w:val="left"/>
+                  </w:pPr>
+                  <w:r>
+                    <w:rPr>
+                      <w:rFonts w:ascii="Consolas" w:cs="Consolas" w:eastAsia="Consolas" w:hAnsi="Consolas"/>
+                      <w:color w:val="1A1A1A"/>
+                      <w:sz w:val="22"/>
+                      <w:szCs w:val="22"/>
+                    </w:rPr>
+                    <w:t xml:space="preserve">150 : 5 = ? : 1</w:t>
+                  </w:r>
+                </w:p>
+              </w:tc>
+              <w:tc>
+                <w:tcPr>
+                  <w:tcW w:type="dxa" w:w="1700"/>
+                  <w:tcBorders>
+                    <w:top w:val="none" w:color="FFFFFF" w:sz="0"/>
+                    <w:left w:val="none" w:color="FFFFFF" w:sz="0"/>
+                    <w:bottom w:val="none" w:color="FFFFFF" w:sz="0"/>
+                    <w:right w:val="none" w:color="FFFFFF" w:sz="0"/>
+                  </w:tcBorders>
+                  <w:tcMar>
+                    <w:top w:type="dxa" w:w="30"/>
+                    <w:left w:type="dxa" w:w="10"/>
+                    <w:bottom w:type="dxa" w:w="30"/>
+                    <w:right w:type="dxa" w:w="10"/>
+                  </w:tcMar>
+                  <w:vAlign w:val="center"/>
+                </w:tcPr>
+                <w:p>
+                  <w:pPr>
+                    <w:jc w:val="left"/>
+                  </w:pPr>
+                  <w:r>
+                    <w:rPr>
+                      <w:rFonts w:ascii="Consolas" w:cs="Consolas" w:eastAsia="Consolas" w:hAnsi="Consolas"/>
+                      <w:color w:val="1A1A1A"/>
+                      <w:sz w:val="22"/>
+                      <w:szCs w:val="22"/>
+                    </w:rPr>
+                    <w:t xml:space="preserve">? = ______</w:t>
+                  </w:r>
+                </w:p>
+              </w:tc>
+            </w:tr>
+          </w:tbl>
           <w:p>
             <w:pPr>
-              <w:spacing w:line="320"/>
+              <w:spacing w:after="0" w:line="120" w:lineRule="exact"/>
             </w:pPr>
-            <w:r>
-              <w:rPr>
-                <w:b/>
-                <w:bCs/>
-                <w:color w:val="2E5A87"/>
-                <w:sz w:val="20"/>
-                <w:szCs w:val="20"/>
-              </w:rPr>
-              <w:t xml:space="preserve">4)  </w:t>
-            </w:r>
-            <w:r>
-              <w:rPr>
-                <w:rFonts w:ascii="Consolas" w:cs="Consolas" w:eastAsia="Consolas" w:hAnsi="Consolas"/>
-                <w:color w:val="1A1A1A"/>
-                <w:sz w:val="22"/>
-                <w:szCs w:val="22"/>
-              </w:rPr>
-              <w:t xml:space="preserve">150 miles ÷ 5 hours  =  ______</w:t>
-            </w:r>
           </w:p>
         </w:tc>
       </w:tr>
@@ -814,29 +1545,372 @@
               <w:right w:type="dxa" w:w="120"/>
             </w:tcMar>
           </w:tcPr>
+          <w:tbl>
+            <w:tblPr>
+              <w:tblW w:type="dxa" w:w="4360"/>
+              <w:jc w:val="left"/>
+              <w:tblBorders>
+                <w:top w:val="single" w:color="auto" w:sz="4"/>
+                <w:left w:val="single" w:color="auto" w:sz="4"/>
+                <w:bottom w:val="single" w:color="auto" w:sz="4"/>
+                <w:right w:val="single" w:color="auto" w:sz="4"/>
+                <w:insideH w:val="single" w:color="auto" w:sz="4"/>
+                <w:insideV w:val="single" w:color="auto" w:sz="4"/>
+              </w:tblBorders>
+            </w:tblPr>
+            <w:tblGrid>
+              <w:gridCol w:w="360"/>
+              <w:gridCol w:w="700"/>
+              <w:gridCol w:w="520"/>
+              <w:gridCol w:w="700"/>
+              <w:gridCol w:w="380"/>
+              <w:gridCol w:w="1700"/>
+            </w:tblGrid>
+            <w:tr>
+              <w:tc>
+                <w:tcPr>
+                  <w:tcW w:type="dxa" w:w="360"/>
+                  <w:tcBorders>
+                    <w:top w:val="none" w:color="FFFFFF" w:sz="0"/>
+                    <w:left w:val="none" w:color="FFFFFF" w:sz="0"/>
+                    <w:bottom w:val="none" w:color="FFFFFF" w:sz="0"/>
+                    <w:right w:val="none" w:color="FFFFFF" w:sz="0"/>
+                  </w:tcBorders>
+                  <w:tcMar>
+                    <w:top w:type="dxa" w:w="30"/>
+                    <w:left w:type="dxa" w:w="10"/>
+                    <w:bottom w:type="dxa" w:w="30"/>
+                    <w:right w:type="dxa" w:w="10"/>
+                  </w:tcMar>
+                  <w:vAlign w:val="center"/>
+                </w:tcPr>
+                <w:p>
+                  <w:pPr>
+                    <w:jc w:val="left"/>
+                  </w:pPr>
+                  <w:r>
+                    <w:rPr>
+                      <w:b/>
+                      <w:bCs/>
+                      <w:color w:val="2E5A87"/>
+                      <w:sz w:val="20"/>
+                      <w:szCs w:val="20"/>
+                    </w:rPr>
+                    <w:t xml:space="preserve">5)</w:t>
+                  </w:r>
+                </w:p>
+              </w:tc>
+              <w:tc>
+                <w:tcPr>
+                  <w:tcW w:type="dxa" w:w="700"/>
+                  <w:tcBorders>
+                    <w:top w:val="none" w:color="FFFFFF" w:sz="0"/>
+                    <w:left w:val="none" w:color="FFFFFF" w:sz="0"/>
+                    <w:bottom w:val="none" w:color="FFFFFF" w:sz="0"/>
+                    <w:right w:val="none" w:color="FFFFFF" w:sz="0"/>
+                  </w:tcBorders>
+                  <w:tcMar>
+                    <w:top w:type="dxa" w:w="30"/>
+                    <w:left w:type="dxa" w:w="20"/>
+                    <w:bottom w:type="dxa" w:w="30"/>
+                    <w:right w:type="dxa" w:w="20"/>
+                  </w:tcMar>
+                  <w:vAlign w:val="center"/>
+                </w:tcPr>
+                <w:tbl>
+                  <w:tblPr>
+                    <w:tblW w:type="dxa" w:w="600"/>
+                    <w:jc w:val="center"/>
+                    <w:tblBorders>
+                      <w:top w:val="single" w:color="auto" w:sz="4"/>
+                      <w:left w:val="single" w:color="auto" w:sz="4"/>
+                      <w:bottom w:val="single" w:color="auto" w:sz="4"/>
+                      <w:right w:val="single" w:color="auto" w:sz="4"/>
+                      <w:insideH w:val="none" w:color="FFFFFF" w:sz="0"/>
+                      <w:insideV w:val="single" w:color="auto" w:sz="4"/>
+                    </w:tblBorders>
+                  </w:tblPr>
+                  <w:tblGrid>
+                    <w:gridCol w:w="600"/>
+                  </w:tblGrid>
+                  <w:tr>
+                    <w:tc>
+                      <w:tcPr>
+                        <w:tcW w:type="dxa" w:w="520"/>
+                        <w:tcBorders>
+                          <w:top w:val="none" w:color="FFFFFF" w:sz="0"/>
+                          <w:left w:val="none" w:color="FFFFFF" w:sz="0"/>
+                          <w:bottom w:val="single" w:color="1A1A1A" w:sz="8"/>
+                          <w:right w:val="none" w:color="FFFFFF" w:sz="0"/>
+                        </w:tcBorders>
+                        <w:tcMar>
+                          <w:top w:type="dxa" w:w="0"/>
+                          <w:left w:type="dxa" w:w="30"/>
+                          <w:bottom w:type="dxa" w:w="0"/>
+                          <w:right w:type="dxa" w:w="30"/>
+                        </w:tcMar>
+                      </w:tcPr>
+                      <w:p>
+                        <w:pPr>
+                          <w:spacing w:after="0" w:line="230"/>
+                          <w:jc w:val="center"/>
+                        </w:pPr>
+                        <w:r>
+                          <w:rPr>
+                            <w:rFonts w:ascii="Consolas" w:cs="Consolas" w:eastAsia="Consolas" w:hAnsi="Consolas"/>
+                            <w:b/>
+                            <w:bCs/>
+                            <w:color w:val="1A1A1A"/>
+                            <w:sz w:val="26"/>
+                            <w:szCs w:val="26"/>
+                          </w:rPr>
+                          <w:t xml:space="preserve">?</w:t>
+                        </w:r>
+                      </w:p>
+                    </w:tc>
+                  </w:tr>
+                  <w:tr>
+                    <w:tc>
+                      <w:tcPr>
+                        <w:tcW w:type="dxa" w:w="520"/>
+                        <w:tcBorders>
+                          <w:top w:val="none" w:color="FFFFFF" w:sz="0"/>
+                          <w:left w:val="none" w:color="FFFFFF" w:sz="0"/>
+                          <w:bottom w:val="none" w:color="FFFFFF" w:sz="0"/>
+                          <w:right w:val="none" w:color="FFFFFF" w:sz="0"/>
+                        </w:tcBorders>
+                        <w:tcMar>
+                          <w:top w:type="dxa" w:w="0"/>
+                          <w:left w:type="dxa" w:w="30"/>
+                          <w:bottom w:type="dxa" w:w="0"/>
+                          <w:right w:type="dxa" w:w="30"/>
+                        </w:tcMar>
+                      </w:tcPr>
+                      <w:p>
+                        <w:pPr>
+                          <w:spacing w:after="0" w:line="230"/>
+                          <w:jc w:val="center"/>
+                        </w:pPr>
+                        <w:r>
+                          <w:rPr>
+                            <w:rFonts w:ascii="Consolas" w:cs="Consolas" w:eastAsia="Consolas" w:hAnsi="Consolas"/>
+                            <w:b/>
+                            <w:bCs/>
+                            <w:color w:val="1A1A1A"/>
+                            <w:sz w:val="26"/>
+                            <w:szCs w:val="26"/>
+                          </w:rPr>
+                          <w:t xml:space="preserve">3</w:t>
+                        </w:r>
+                      </w:p>
+                    </w:tc>
+                  </w:tr>
+                </w:tbl>
+                <w:p/>
+              </w:tc>
+              <w:tc>
+                <w:tcPr>
+                  <w:tcW w:type="dxa" w:w="520"/>
+                  <w:tcBorders>
+                    <w:top w:val="none" w:color="FFFFFF" w:sz="0"/>
+                    <w:left w:val="none" w:color="FFFFFF" w:sz="0"/>
+                    <w:bottom w:val="none" w:color="FFFFFF" w:sz="0"/>
+                    <w:right w:val="none" w:color="FFFFFF" w:sz="0"/>
+                  </w:tcBorders>
+                  <w:tcMar>
+                    <w:top w:type="dxa" w:w="30"/>
+                    <w:left w:type="dxa" w:w="10"/>
+                    <w:bottom w:type="dxa" w:w="30"/>
+                    <w:right w:type="dxa" w:w="10"/>
+                  </w:tcMar>
+                  <w:vAlign w:val="center"/>
+                </w:tcPr>
+                <w:p>
+                  <w:pPr>
+                    <w:jc w:val="center"/>
+                  </w:pPr>
+                  <w:r>
+                    <w:rPr>
+                      <w:rFonts w:ascii="Consolas" w:cs="Consolas" w:eastAsia="Consolas" w:hAnsi="Consolas"/>
+                      <w:b/>
+                      <w:bCs/>
+                      <w:color w:val="7A86A8"/>
+                      <w:sz w:val="26"/>
+                      <w:szCs w:val="26"/>
+                    </w:rPr>
+                    <w:t xml:space="preserve">=</w:t>
+                  </w:r>
+                </w:p>
+              </w:tc>
+              <w:tc>
+                <w:tcPr>
+                  <w:tcW w:type="dxa" w:w="700"/>
+                  <w:tcBorders>
+                    <w:top w:val="none" w:color="FFFFFF" w:sz="0"/>
+                    <w:left w:val="none" w:color="FFFFFF" w:sz="0"/>
+                    <w:bottom w:val="none" w:color="FFFFFF" w:sz="0"/>
+                    <w:right w:val="none" w:color="FFFFFF" w:sz="0"/>
+                  </w:tcBorders>
+                  <w:tcMar>
+                    <w:top w:type="dxa" w:w="30"/>
+                    <w:left w:type="dxa" w:w="20"/>
+                    <w:bottom w:type="dxa" w:w="30"/>
+                    <w:right w:type="dxa" w:w="20"/>
+                  </w:tcMar>
+                  <w:vAlign w:val="center"/>
+                </w:tcPr>
+                <w:tbl>
+                  <w:tblPr>
+                    <w:tblW w:type="dxa" w:w="600"/>
+                    <w:jc w:val="center"/>
+                    <w:tblBorders>
+                      <w:top w:val="single" w:color="auto" w:sz="4"/>
+                      <w:left w:val="single" w:color="auto" w:sz="4"/>
+                      <w:bottom w:val="single" w:color="auto" w:sz="4"/>
+                      <w:right w:val="single" w:color="auto" w:sz="4"/>
+                      <w:insideH w:val="none" w:color="FFFFFF" w:sz="0"/>
+                      <w:insideV w:val="single" w:color="auto" w:sz="4"/>
+                    </w:tblBorders>
+                  </w:tblPr>
+                  <w:tblGrid>
+                    <w:gridCol w:w="600"/>
+                  </w:tblGrid>
+                  <w:tr>
+                    <w:tc>
+                      <w:tcPr>
+                        <w:tcW w:type="dxa" w:w="520"/>
+                        <w:tcBorders>
+                          <w:top w:val="none" w:color="FFFFFF" w:sz="0"/>
+                          <w:left w:val="none" w:color="FFFFFF" w:sz="0"/>
+                          <w:bottom w:val="single" w:color="1A1A1A" w:sz="8"/>
+                          <w:right w:val="none" w:color="FFFFFF" w:sz="0"/>
+                        </w:tcBorders>
+                        <w:tcMar>
+                          <w:top w:type="dxa" w:w="0"/>
+                          <w:left w:type="dxa" w:w="30"/>
+                          <w:bottom w:type="dxa" w:w="0"/>
+                          <w:right w:type="dxa" w:w="30"/>
+                        </w:tcMar>
+                      </w:tcPr>
+                      <w:p>
+                        <w:pPr>
+                          <w:spacing w:after="0" w:line="230"/>
+                          <w:jc w:val="center"/>
+                        </w:pPr>
+                        <w:r>
+                          <w:rPr>
+                            <w:rFonts w:ascii="Consolas" w:cs="Consolas" w:eastAsia="Consolas" w:hAnsi="Consolas"/>
+                            <w:b/>
+                            <w:bCs/>
+                            <w:color w:val="1A1A1A"/>
+                            <w:sz w:val="26"/>
+                            <w:szCs w:val="26"/>
+                          </w:rPr>
+                          <w:t xml:space="preserve">8</w:t>
+                        </w:r>
+                      </w:p>
+                    </w:tc>
+                  </w:tr>
+                  <w:tr>
+                    <w:tc>
+                      <w:tcPr>
+                        <w:tcW w:type="dxa" w:w="520"/>
+                        <w:tcBorders>
+                          <w:top w:val="none" w:color="FFFFFF" w:sz="0"/>
+                          <w:left w:val="none" w:color="FFFFFF" w:sz="0"/>
+                          <w:bottom w:val="none" w:color="FFFFFF" w:sz="0"/>
+                          <w:right w:val="none" w:color="FFFFFF" w:sz="0"/>
+                        </w:tcBorders>
+                        <w:tcMar>
+                          <w:top w:type="dxa" w:w="0"/>
+                          <w:left w:type="dxa" w:w="30"/>
+                          <w:bottom w:type="dxa" w:w="0"/>
+                          <w:right w:type="dxa" w:w="30"/>
+                        </w:tcMar>
+                      </w:tcPr>
+                      <w:p>
+                        <w:pPr>
+                          <w:spacing w:after="0" w:line="230"/>
+                          <w:jc w:val="center"/>
+                        </w:pPr>
+                        <w:r>
+                          <w:rPr>
+                            <w:rFonts w:ascii="Consolas" w:cs="Consolas" w:eastAsia="Consolas" w:hAnsi="Consolas"/>
+                            <w:b/>
+                            <w:bCs/>
+                            <w:color w:val="1A1A1A"/>
+                            <w:sz w:val="26"/>
+                            <w:szCs w:val="26"/>
+                          </w:rPr>
+                          <w:t xml:space="preserve">12</w:t>
+                        </w:r>
+                      </w:p>
+                    </w:tc>
+                  </w:tr>
+                </w:tbl>
+                <w:p/>
+              </w:tc>
+              <w:tc>
+                <w:tcPr>
+                  <w:tcW w:type="dxa" w:w="380"/>
+                  <w:tcBorders>
+                    <w:top w:val="none" w:color="FFFFFF" w:sz="0"/>
+                    <w:left w:val="none" w:color="FFFFFF" w:sz="0"/>
+                    <w:bottom w:val="none" w:color="FFFFFF" w:sz="0"/>
+                    <w:right w:val="none" w:color="FFFFFF" w:sz="0"/>
+                  </w:tcBorders>
+                  <w:tcMar>
+                    <w:top w:type="dxa" w:w="30"/>
+                    <w:left w:type="dxa" w:w="10"/>
+                    <w:bottom w:type="dxa" w:w="30"/>
+                    <w:right w:type="dxa" w:w="10"/>
+                  </w:tcMar>
+                  <w:vAlign w:val="center"/>
+                </w:tcPr>
+                <w:p>
+                  <w:pPr>
+                    <w:jc w:val="center"/>
+                  </w:pPr>
+                </w:p>
+              </w:tc>
+              <w:tc>
+                <w:tcPr>
+                  <w:tcW w:type="dxa" w:w="1700"/>
+                  <w:tcBorders>
+                    <w:top w:val="none" w:color="FFFFFF" w:sz="0"/>
+                    <w:left w:val="none" w:color="FFFFFF" w:sz="0"/>
+                    <w:bottom w:val="none" w:color="FFFFFF" w:sz="0"/>
+                    <w:right w:val="none" w:color="FFFFFF" w:sz="0"/>
+                  </w:tcBorders>
+                  <w:tcMar>
+                    <w:top w:type="dxa" w:w="30"/>
+                    <w:left w:type="dxa" w:w="10"/>
+                    <w:bottom w:type="dxa" w:w="30"/>
+                    <w:right w:type="dxa" w:w="10"/>
+                  </w:tcMar>
+                  <w:vAlign w:val="center"/>
+                </w:tcPr>
+                <w:p>
+                  <w:pPr>
+                    <w:jc w:val="left"/>
+                  </w:pPr>
+                  <w:r>
+                    <w:rPr>
+                      <w:rFonts w:ascii="Consolas" w:cs="Consolas" w:eastAsia="Consolas" w:hAnsi="Consolas"/>
+                      <w:color w:val="1A1A1A"/>
+                      <w:sz w:val="22"/>
+                      <w:szCs w:val="22"/>
+                    </w:rPr>
+                    <w:t xml:space="preserve">? = ______</w:t>
+                  </w:r>
+                </w:p>
+              </w:tc>
+            </w:tr>
+          </w:tbl>
           <w:p>
             <w:pPr>
-              <w:spacing w:line="320"/>
+              <w:spacing w:after="0" w:line="120" w:lineRule="exact"/>
             </w:pPr>
-            <w:r>
-              <w:rPr>
-                <w:b/>
-                <w:bCs/>
-                <w:color w:val="2E5A87"/>
-                <w:sz w:val="20"/>
-                <w:szCs w:val="20"/>
-              </w:rPr>
-              <w:t xml:space="preserve">5)  </w:t>
-            </w:r>
-            <w:r>
-              <w:rPr>
-                <w:rFonts w:ascii="Consolas" w:cs="Consolas" w:eastAsia="Consolas" w:hAnsi="Consolas"/>
-                <w:color w:val="1A1A1A"/>
-                <w:sz w:val="22"/>
-                <w:szCs w:val="22"/>
-              </w:rPr>
-              <w:t xml:space="preserve">Solve  x/3 = 8/12  =  ______</w:t>
-            </w:r>
           </w:p>
         </w:tc>
         <w:tc>
@@ -855,29 +1929,372 @@
               <w:right w:type="dxa" w:w="120"/>
             </w:tcMar>
           </w:tcPr>
+          <w:tbl>
+            <w:tblPr>
+              <w:tblW w:type="dxa" w:w="4360"/>
+              <w:jc w:val="left"/>
+              <w:tblBorders>
+                <w:top w:val="single" w:color="auto" w:sz="4"/>
+                <w:left w:val="single" w:color="auto" w:sz="4"/>
+                <w:bottom w:val="single" w:color="auto" w:sz="4"/>
+                <w:right w:val="single" w:color="auto" w:sz="4"/>
+                <w:insideH w:val="single" w:color="auto" w:sz="4"/>
+                <w:insideV w:val="single" w:color="auto" w:sz="4"/>
+              </w:tblBorders>
+            </w:tblPr>
+            <w:tblGrid>
+              <w:gridCol w:w="360"/>
+              <w:gridCol w:w="700"/>
+              <w:gridCol w:w="520"/>
+              <w:gridCol w:w="700"/>
+              <w:gridCol w:w="380"/>
+              <w:gridCol w:w="1700"/>
+            </w:tblGrid>
+            <w:tr>
+              <w:tc>
+                <w:tcPr>
+                  <w:tcW w:type="dxa" w:w="360"/>
+                  <w:tcBorders>
+                    <w:top w:val="none" w:color="FFFFFF" w:sz="0"/>
+                    <w:left w:val="none" w:color="FFFFFF" w:sz="0"/>
+                    <w:bottom w:val="none" w:color="FFFFFF" w:sz="0"/>
+                    <w:right w:val="none" w:color="FFFFFF" w:sz="0"/>
+                  </w:tcBorders>
+                  <w:tcMar>
+                    <w:top w:type="dxa" w:w="30"/>
+                    <w:left w:type="dxa" w:w="10"/>
+                    <w:bottom w:type="dxa" w:w="30"/>
+                    <w:right w:type="dxa" w:w="10"/>
+                  </w:tcMar>
+                  <w:vAlign w:val="center"/>
+                </w:tcPr>
+                <w:p>
+                  <w:pPr>
+                    <w:jc w:val="left"/>
+                  </w:pPr>
+                  <w:r>
+                    <w:rPr>
+                      <w:b/>
+                      <w:bCs/>
+                      <w:color w:val="2E5A87"/>
+                      <w:sz w:val="20"/>
+                      <w:szCs w:val="20"/>
+                    </w:rPr>
+                    <w:t xml:space="preserve">6)</w:t>
+                  </w:r>
+                </w:p>
+              </w:tc>
+              <w:tc>
+                <w:tcPr>
+                  <w:tcW w:type="dxa" w:w="700"/>
+                  <w:tcBorders>
+                    <w:top w:val="none" w:color="FFFFFF" w:sz="0"/>
+                    <w:left w:val="none" w:color="FFFFFF" w:sz="0"/>
+                    <w:bottom w:val="none" w:color="FFFFFF" w:sz="0"/>
+                    <w:right w:val="none" w:color="FFFFFF" w:sz="0"/>
+                  </w:tcBorders>
+                  <w:tcMar>
+                    <w:top w:type="dxa" w:w="30"/>
+                    <w:left w:type="dxa" w:w="20"/>
+                    <w:bottom w:type="dxa" w:w="30"/>
+                    <w:right w:type="dxa" w:w="20"/>
+                  </w:tcMar>
+                  <w:vAlign w:val="center"/>
+                </w:tcPr>
+                <w:tbl>
+                  <w:tblPr>
+                    <w:tblW w:type="dxa" w:w="600"/>
+                    <w:jc w:val="center"/>
+                    <w:tblBorders>
+                      <w:top w:val="single" w:color="auto" w:sz="4"/>
+                      <w:left w:val="single" w:color="auto" w:sz="4"/>
+                      <w:bottom w:val="single" w:color="auto" w:sz="4"/>
+                      <w:right w:val="single" w:color="auto" w:sz="4"/>
+                      <w:insideH w:val="none" w:color="FFFFFF" w:sz="0"/>
+                      <w:insideV w:val="single" w:color="auto" w:sz="4"/>
+                    </w:tblBorders>
+                  </w:tblPr>
+                  <w:tblGrid>
+                    <w:gridCol w:w="600"/>
+                  </w:tblGrid>
+                  <w:tr>
+                    <w:tc>
+                      <w:tcPr>
+                        <w:tcW w:type="dxa" w:w="520"/>
+                        <w:tcBorders>
+                          <w:top w:val="none" w:color="FFFFFF" w:sz="0"/>
+                          <w:left w:val="none" w:color="FFFFFF" w:sz="0"/>
+                          <w:bottom w:val="single" w:color="1A1A1A" w:sz="8"/>
+                          <w:right w:val="none" w:color="FFFFFF" w:sz="0"/>
+                        </w:tcBorders>
+                        <w:tcMar>
+                          <w:top w:type="dxa" w:w="0"/>
+                          <w:left w:type="dxa" w:w="30"/>
+                          <w:bottom w:type="dxa" w:w="0"/>
+                          <w:right w:type="dxa" w:w="30"/>
+                        </w:tcMar>
+                      </w:tcPr>
+                      <w:p>
+                        <w:pPr>
+                          <w:spacing w:after="0" w:line="230"/>
+                          <w:jc w:val="center"/>
+                        </w:pPr>
+                        <w:r>
+                          <w:rPr>
+                            <w:rFonts w:ascii="Consolas" w:cs="Consolas" w:eastAsia="Consolas" w:hAnsi="Consolas"/>
+                            <w:b/>
+                            <w:bCs/>
+                            <w:color w:val="1A1A1A"/>
+                            <w:sz w:val="26"/>
+                            <w:szCs w:val="26"/>
+                          </w:rPr>
+                          <w:t xml:space="preserve">6</w:t>
+                        </w:r>
+                      </w:p>
+                    </w:tc>
+                  </w:tr>
+                  <w:tr>
+                    <w:tc>
+                      <w:tcPr>
+                        <w:tcW w:type="dxa" w:w="520"/>
+                        <w:tcBorders>
+                          <w:top w:val="none" w:color="FFFFFF" w:sz="0"/>
+                          <w:left w:val="none" w:color="FFFFFF" w:sz="0"/>
+                          <w:bottom w:val="none" w:color="FFFFFF" w:sz="0"/>
+                          <w:right w:val="none" w:color="FFFFFF" w:sz="0"/>
+                        </w:tcBorders>
+                        <w:tcMar>
+                          <w:top w:type="dxa" w:w="0"/>
+                          <w:left w:type="dxa" w:w="30"/>
+                          <w:bottom w:type="dxa" w:w="0"/>
+                          <w:right w:type="dxa" w:w="30"/>
+                        </w:tcMar>
+                      </w:tcPr>
+                      <w:p>
+                        <w:pPr>
+                          <w:spacing w:after="0" w:line="230"/>
+                          <w:jc w:val="center"/>
+                        </w:pPr>
+                        <w:r>
+                          <w:rPr>
+                            <w:rFonts w:ascii="Consolas" w:cs="Consolas" w:eastAsia="Consolas" w:hAnsi="Consolas"/>
+                            <w:b/>
+                            <w:bCs/>
+                            <w:color w:val="1A1A1A"/>
+                            <w:sz w:val="26"/>
+                            <w:szCs w:val="26"/>
+                          </w:rPr>
+                          <w:t xml:space="preserve">8</w:t>
+                        </w:r>
+                      </w:p>
+                    </w:tc>
+                  </w:tr>
+                </w:tbl>
+                <w:p/>
+              </w:tc>
+              <w:tc>
+                <w:tcPr>
+                  <w:tcW w:type="dxa" w:w="520"/>
+                  <w:tcBorders>
+                    <w:top w:val="none" w:color="FFFFFF" w:sz="0"/>
+                    <w:left w:val="none" w:color="FFFFFF" w:sz="0"/>
+                    <w:bottom w:val="none" w:color="FFFFFF" w:sz="0"/>
+                    <w:right w:val="none" w:color="FFFFFF" w:sz="0"/>
+                  </w:tcBorders>
+                  <w:tcMar>
+                    <w:top w:type="dxa" w:w="30"/>
+                    <w:left w:type="dxa" w:w="10"/>
+                    <w:bottom w:type="dxa" w:w="30"/>
+                    <w:right w:type="dxa" w:w="10"/>
+                  </w:tcMar>
+                  <w:vAlign w:val="center"/>
+                </w:tcPr>
+                <w:p>
+                  <w:pPr>
+                    <w:jc w:val="center"/>
+                  </w:pPr>
+                  <w:r>
+                    <w:rPr>
+                      <w:rFonts w:ascii="Consolas" w:cs="Consolas" w:eastAsia="Consolas" w:hAnsi="Consolas"/>
+                      <w:b/>
+                      <w:bCs/>
+                      <w:color w:val="7A86A8"/>
+                      <w:sz w:val="26"/>
+                      <w:szCs w:val="26"/>
+                    </w:rPr>
+                    <w:t xml:space="preserve">=</w:t>
+                  </w:r>
+                </w:p>
+              </w:tc>
+              <w:tc>
+                <w:tcPr>
+                  <w:tcW w:type="dxa" w:w="700"/>
+                  <w:tcBorders>
+                    <w:top w:val="none" w:color="FFFFFF" w:sz="0"/>
+                    <w:left w:val="none" w:color="FFFFFF" w:sz="0"/>
+                    <w:bottom w:val="none" w:color="FFFFFF" w:sz="0"/>
+                    <w:right w:val="none" w:color="FFFFFF" w:sz="0"/>
+                  </w:tcBorders>
+                  <w:tcMar>
+                    <w:top w:type="dxa" w:w="30"/>
+                    <w:left w:type="dxa" w:w="20"/>
+                    <w:bottom w:type="dxa" w:w="30"/>
+                    <w:right w:type="dxa" w:w="20"/>
+                  </w:tcMar>
+                  <w:vAlign w:val="center"/>
+                </w:tcPr>
+                <w:tbl>
+                  <w:tblPr>
+                    <w:tblW w:type="dxa" w:w="600"/>
+                    <w:jc w:val="center"/>
+                    <w:tblBorders>
+                      <w:top w:val="single" w:color="auto" w:sz="4"/>
+                      <w:left w:val="single" w:color="auto" w:sz="4"/>
+                      <w:bottom w:val="single" w:color="auto" w:sz="4"/>
+                      <w:right w:val="single" w:color="auto" w:sz="4"/>
+                      <w:insideH w:val="none" w:color="FFFFFF" w:sz="0"/>
+                      <w:insideV w:val="single" w:color="auto" w:sz="4"/>
+                    </w:tblBorders>
+                  </w:tblPr>
+                  <w:tblGrid>
+                    <w:gridCol w:w="600"/>
+                  </w:tblGrid>
+                  <w:tr>
+                    <w:tc>
+                      <w:tcPr>
+                        <w:tcW w:type="dxa" w:w="520"/>
+                        <w:tcBorders>
+                          <w:top w:val="none" w:color="FFFFFF" w:sz="0"/>
+                          <w:left w:val="none" w:color="FFFFFF" w:sz="0"/>
+                          <w:bottom w:val="single" w:color="1A1A1A" w:sz="8"/>
+                          <w:right w:val="none" w:color="FFFFFF" w:sz="0"/>
+                        </w:tcBorders>
+                        <w:tcMar>
+                          <w:top w:type="dxa" w:w="0"/>
+                          <w:left w:type="dxa" w:w="30"/>
+                          <w:bottom w:type="dxa" w:w="0"/>
+                          <w:right w:type="dxa" w:w="30"/>
+                        </w:tcMar>
+                      </w:tcPr>
+                      <w:p>
+                        <w:pPr>
+                          <w:spacing w:after="0" w:line="230"/>
+                          <w:jc w:val="center"/>
+                        </w:pPr>
+                        <w:r>
+                          <w:rPr>
+                            <w:rFonts w:ascii="Consolas" w:cs="Consolas" w:eastAsia="Consolas" w:hAnsi="Consolas"/>
+                            <w:b/>
+                            <w:bCs/>
+                            <w:color w:val="1A1A1A"/>
+                            <w:sz w:val="26"/>
+                            <w:szCs w:val="26"/>
+                          </w:rPr>
+                          <w:t xml:space="preserve">3</w:t>
+                        </w:r>
+                      </w:p>
+                    </w:tc>
+                  </w:tr>
+                  <w:tr>
+                    <w:tc>
+                      <w:tcPr>
+                        <w:tcW w:type="dxa" w:w="520"/>
+                        <w:tcBorders>
+                          <w:top w:val="none" w:color="FFFFFF" w:sz="0"/>
+                          <w:left w:val="none" w:color="FFFFFF" w:sz="0"/>
+                          <w:bottom w:val="none" w:color="FFFFFF" w:sz="0"/>
+                          <w:right w:val="none" w:color="FFFFFF" w:sz="0"/>
+                        </w:tcBorders>
+                        <w:tcMar>
+                          <w:top w:type="dxa" w:w="0"/>
+                          <w:left w:type="dxa" w:w="30"/>
+                          <w:bottom w:type="dxa" w:w="0"/>
+                          <w:right w:type="dxa" w:w="30"/>
+                        </w:tcMar>
+                      </w:tcPr>
+                      <w:p>
+                        <w:pPr>
+                          <w:spacing w:after="0" w:line="230"/>
+                          <w:jc w:val="center"/>
+                        </w:pPr>
+                        <w:r>
+                          <w:rPr>
+                            <w:rFonts w:ascii="Consolas" w:cs="Consolas" w:eastAsia="Consolas" w:hAnsi="Consolas"/>
+                            <w:b/>
+                            <w:bCs/>
+                            <w:color w:val="1A1A1A"/>
+                            <w:sz w:val="26"/>
+                            <w:szCs w:val="26"/>
+                          </w:rPr>
+                          <w:t xml:space="preserve">?</w:t>
+                        </w:r>
+                      </w:p>
+                    </w:tc>
+                  </w:tr>
+                </w:tbl>
+                <w:p/>
+              </w:tc>
+              <w:tc>
+                <w:tcPr>
+                  <w:tcW w:type="dxa" w:w="380"/>
+                  <w:tcBorders>
+                    <w:top w:val="none" w:color="FFFFFF" w:sz="0"/>
+                    <w:left w:val="none" w:color="FFFFFF" w:sz="0"/>
+                    <w:bottom w:val="none" w:color="FFFFFF" w:sz="0"/>
+                    <w:right w:val="none" w:color="FFFFFF" w:sz="0"/>
+                  </w:tcBorders>
+                  <w:tcMar>
+                    <w:top w:type="dxa" w:w="30"/>
+                    <w:left w:type="dxa" w:w="10"/>
+                    <w:bottom w:type="dxa" w:w="30"/>
+                    <w:right w:type="dxa" w:w="10"/>
+                  </w:tcMar>
+                  <w:vAlign w:val="center"/>
+                </w:tcPr>
+                <w:p>
+                  <w:pPr>
+                    <w:jc w:val="center"/>
+                  </w:pPr>
+                </w:p>
+              </w:tc>
+              <w:tc>
+                <w:tcPr>
+                  <w:tcW w:type="dxa" w:w="1700"/>
+                  <w:tcBorders>
+                    <w:top w:val="none" w:color="FFFFFF" w:sz="0"/>
+                    <w:left w:val="none" w:color="FFFFFF" w:sz="0"/>
+                    <w:bottom w:val="none" w:color="FFFFFF" w:sz="0"/>
+                    <w:right w:val="none" w:color="FFFFFF" w:sz="0"/>
+                  </w:tcBorders>
+                  <w:tcMar>
+                    <w:top w:type="dxa" w:w="30"/>
+                    <w:left w:type="dxa" w:w="10"/>
+                    <w:bottom w:type="dxa" w:w="30"/>
+                    <w:right w:type="dxa" w:w="10"/>
+                  </w:tcMar>
+                  <w:vAlign w:val="center"/>
+                </w:tcPr>
+                <w:p>
+                  <w:pPr>
+                    <w:jc w:val="left"/>
+                  </w:pPr>
+                  <w:r>
+                    <w:rPr>
+                      <w:rFonts w:ascii="Consolas" w:cs="Consolas" w:eastAsia="Consolas" w:hAnsi="Consolas"/>
+                      <w:color w:val="1A1A1A"/>
+                      <w:sz w:val="22"/>
+                      <w:szCs w:val="22"/>
+                    </w:rPr>
+                    <w:t xml:space="preserve">? = ______</w:t>
+                  </w:r>
+                </w:p>
+              </w:tc>
+            </w:tr>
+          </w:tbl>
           <w:p>
             <w:pPr>
-              <w:spacing w:line="320"/>
+              <w:spacing w:after="0" w:line="120" w:lineRule="exact"/>
             </w:pPr>
-            <w:r>
-              <w:rPr>
-                <w:b/>
-                <w:bCs/>
-                <w:color w:val="2E5A87"/>
-                <w:sz w:val="20"/>
-                <w:szCs w:val="20"/>
-              </w:rPr>
-              <w:t xml:space="preserve">6)  </w:t>
-            </w:r>
-            <w:r>
-              <w:rPr>
-                <w:rFonts w:ascii="Consolas" w:cs="Consolas" w:eastAsia="Consolas" w:hAnsi="Consolas"/>
-                <w:color w:val="1A1A1A"/>
-                <w:sz w:val="22"/>
-                <w:szCs w:val="22"/>
-              </w:rPr>
-              <w:t xml:space="preserve">$20 for 4 → $ per 1  =  ______</w:t>
-            </w:r>
           </w:p>
         </w:tc>
       </w:tr>
@@ -894,7 +2311,7 @@
           <w:sz w:val="20"/>
           <w:szCs w:val="20"/>
         </w:rPr>
-        <w:t xml:space="preserve">Find 'per one' or the scale factor — then it's easy.  ★</w:t>
+        <w:t xml:space="preserve">Find the scale factor first.  ★</w:t>
       </w:r>
     </w:p>
     <w:sectPr>

</xml_diff>